<commit_message>
Update case study: remove questions, reference Blackboard quiz
- Replace open-ended questions with step-by-step instructions
- Add Assessment section pointing to the Blackboard quiz
- Include table summarizing what the quiz covers per section
- Add tip to keep tool open while answering

Co-Authored-By: Claude Opus 4.6 (1M context) <noreply@anthropic.com>
</commit_message>
<xml_diff>
--- a/case_study_instructions.docx
+++ b/case_study_instructions.docx
@@ -68,7 +68,36 @@
           <w:sz w:val="22"/>
           <w:szCs w:val="22"/>
         </w:rPr>
-        <w:t xml:space="preserve">A specialty coffee shop wants to set prices for a single-origin espresso and an espresso + artisan pastry bundle. They surveyed 50 customers for each product. Your task: find the optimal price for each, compare segments, and derive the pastry price from the difference.</w:t>
+        <w:t xml:space="preserve">A specialty coffee shop wants to set prices for a single-origin espresso and an espresso + artisan pastry bundle. They surveyed 50 customers for each product.</w:t>
+      </w:r>
+    </w:p>
+    <w:p>
+      <w:pPr>
+        <w:spacing w:after="200"/>
+      </w:pPr>
+      <w:r>
+        <w:rPr>
+          <w:sz w:val="22"/>
+          <w:szCs w:val="22"/>
+        </w:rPr>
+        <w:t xml:space="preserve">Complete the three steps below using the WTP Price Optimizer tool, then answer the </w:t>
+      </w:r>
+      <w:r>
+        <w:rPr>
+          <w:b/>
+          <w:bCs/>
+          <w:color w:val="C00000"/>
+          <w:sz w:val="22"/>
+          <w:szCs w:val="22"/>
+        </w:rPr>
+        <w:t xml:space="preserve">Blackboard quiz</w:t>
+      </w:r>
+      <w:r>
+        <w:rPr>
+          <w:sz w:val="22"/>
+          <w:szCs w:val="22"/>
+        </w:rPr>
+        <w:t xml:space="preserve">. The quiz contains specific numerical questions about your results.</w:t>
       </w:r>
     </w:p>
     <w:p>
@@ -76,7 +105,7 @@
         <w:pStyle w:val="Heading1"/>
       </w:pPr>
       <w:r>
-        <w:t xml:space="preserve">Study 1 — Espresso (with segmentation)</w:t>
+        <w:t xml:space="preserve">Step 1 — Espresso (with segmentation)</w:t>
       </w:r>
     </w:p>
     <w:p>
@@ -88,7 +117,7 @@
           <w:sz w:val="22"/>
           <w:szCs w:val="22"/>
         </w:rPr>
-        <w:t xml:space="preserve">The tool opens with Study 1 already created. Rename it to "Espresso". Fill in the following parameters:</w:t>
+        <w:t xml:space="preserve">The tool opens with Study 1 already created. Rename it to “Espresso”. Fill in the following parameters:</w:t>
       </w:r>
     </w:p>
     <w:tbl>
@@ -574,34 +603,16 @@
     </w:tbl>
     <w:p>
       <w:pPr>
-        <w:spacing w:after="100" w:before="200"/>
-      </w:pPr>
-      <w:r>
-        <w:rPr>
-          <w:sz w:val="22"/>
-          <w:szCs w:val="22"/>
-        </w:rPr>
-        <w:t xml:space="preserve">Use Auto Segmentation — split after $3.50.</w:t>
-      </w:r>
-    </w:p>
-    <w:p>
-      <w:pPr>
-        <w:spacing w:after="200"/>
-      </w:pPr>
-      <w:r>
-        <w:rPr>
-          <w:sz w:val="22"/>
-          <w:szCs w:val="22"/>
-        </w:rPr>
-        <w:t xml:space="preserve">Cost parameters are inherited from All Market. Adjust per segment if needed.</w:t>
-      </w:r>
-    </w:p>
-    <w:p>
-      <w:pPr>
-        <w:pStyle w:val="Heading2"/>
-      </w:pPr>
-      <w:r>
-        <w:t xml:space="preserve">Questions:</w:t>
+        <w:spacing w:after="60" w:before="200"/>
+      </w:pPr>
+      <w:r>
+        <w:rPr>
+          <w:b/>
+          <w:bCs/>
+          <w:sz w:val="22"/>
+          <w:szCs w:val="22"/>
+        </w:rPr>
+        <w:t xml:space="preserve">Then:</w:t>
       </w:r>
     </w:p>
     <w:p>
@@ -611,14 +622,14 @@
           <w:ilvl w:val="0"/>
           <w:numId w:val="2"/>
         </w:numPr>
-        <w:spacing w:after="60"/>
-      </w:pPr>
-      <w:r>
-        <w:rPr>
-          <w:sz w:val="22"/>
-          <w:szCs w:val="22"/>
-        </w:rPr>
-        <w:t xml:space="preserve">What is the optimal price for the All Market?</w:t>
+        <w:spacing w:after="50"/>
+      </w:pPr>
+      <w:r>
+        <w:rPr>
+          <w:sz w:val="22"/>
+          <w:szCs w:val="22"/>
+        </w:rPr>
+        <w:t xml:space="preserve">Click Calculate All &amp; Compare to see the All Market results.</w:t>
       </w:r>
     </w:p>
     <w:p>
@@ -628,14 +639,14 @@
           <w:ilvl w:val="0"/>
           <w:numId w:val="2"/>
         </w:numPr>
-        <w:spacing w:after="60"/>
-      </w:pPr>
-      <w:r>
-        <w:rPr>
-          <w:sz w:val="22"/>
-          <w:szCs w:val="22"/>
-        </w:rPr>
-        <w:t xml:space="preserve">What is the optimal price for each segment?</w:t>
+        <w:spacing w:after="50"/>
+      </w:pPr>
+      <w:r>
+        <w:rPr>
+          <w:sz w:val="22"/>
+          <w:szCs w:val="22"/>
+        </w:rPr>
+        <w:t xml:space="preserve">Check the WTP Distribution chart to understand the answer distribution.</w:t>
       </w:r>
     </w:p>
     <w:p>
@@ -645,14 +656,14 @@
           <w:ilvl w:val="0"/>
           <w:numId w:val="2"/>
         </w:numPr>
-        <w:spacing w:after="60"/>
-      </w:pPr>
-      <w:r>
-        <w:rPr>
-          <w:sz w:val="22"/>
-          <w:szCs w:val="22"/>
-        </w:rPr>
-        <w:t xml:space="preserve">Which segment yields higher profit? Higher margin?</w:t>
+        <w:spacing w:after="50"/>
+      </w:pPr>
+      <w:r>
+        <w:rPr>
+          <w:sz w:val="22"/>
+          <w:szCs w:val="22"/>
+        </w:rPr>
+        <w:t xml:space="preserve">Use Auto Segmentation — split after $3.50.</w:t>
       </w:r>
     </w:p>
     <w:p>
@@ -662,14 +673,48 @@
           <w:ilvl w:val="0"/>
           <w:numId w:val="2"/>
         </w:numPr>
-        <w:spacing w:after="60"/>
-      </w:pPr>
-      <w:r>
-        <w:rPr>
-          <w:sz w:val="22"/>
-          <w:szCs w:val="22"/>
-        </w:rPr>
-        <w:t xml:space="preserve">Would you recommend a single price or segment-specific pricing? Why?</w:t>
+        <w:spacing w:after="50"/>
+      </w:pPr>
+      <w:r>
+        <w:rPr>
+          <w:sz w:val="22"/>
+          <w:szCs w:val="22"/>
+        </w:rPr>
+        <w:t xml:space="preserve">Click Calculate All &amp; Compare again to see the segmented results.</w:t>
+      </w:r>
+    </w:p>
+    <w:p>
+      <w:pPr>
+        <w:pStyle w:val="ListParagraph"/>
+        <w:numPr>
+          <w:ilvl w:val="0"/>
+          <w:numId w:val="2"/>
+        </w:numPr>
+        <w:spacing w:after="50"/>
+      </w:pPr>
+      <w:r>
+        <w:rPr>
+          <w:sz w:val="22"/>
+          <w:szCs w:val="22"/>
+        </w:rPr>
+        <w:t xml:space="preserve">Compare the All Market optimal price vs each segment’s optimal price.</w:t>
+      </w:r>
+    </w:p>
+    <w:p>
+      <w:pPr>
+        <w:pStyle w:val="ListParagraph"/>
+        <w:numPr>
+          <w:ilvl w:val="0"/>
+          <w:numId w:val="2"/>
+        </w:numPr>
+        <w:spacing w:after="50"/>
+      </w:pPr>
+      <w:r>
+        <w:rPr>
+          <w:sz w:val="22"/>
+          <w:szCs w:val="22"/>
+        </w:rPr>
+        <w:t xml:space="preserve">Note the profit and margin for All Market, Seg 1, and Seg 2.</w:t>
       </w:r>
     </w:p>
     <w:p>
@@ -677,7 +722,7 @@
         <w:pStyle w:val="Heading1"/>
       </w:pPr>
       <w:r>
-        <w:t xml:space="preserve">Study 2 — Espresso + Pastry Bundle</w:t>
+        <w:t xml:space="preserve">Step 2 — Espresso + Pastry Bundle</w:t>
       </w:r>
     </w:p>
     <w:p>
@@ -689,7 +734,7 @@
           <w:sz w:val="22"/>
           <w:szCs w:val="22"/>
         </w:rPr>
-        <w:t xml:space="preserve">Click + New Study / Product. Name it "Espresso + Pastry". Fill in:</w:t>
+        <w:t xml:space="preserve">Click + New Study / Product. Name it “Espresso + Pastry”. Fill in:</w:t>
       </w:r>
     </w:p>
     <w:tbl>
@@ -1175,7 +1220,26 @@
     </w:tbl>
     <w:p>
       <w:pPr>
-        <w:spacing w:after="200" w:before="200"/>
+        <w:spacing w:after="60" w:before="200"/>
+      </w:pPr>
+      <w:r>
+        <w:rPr>
+          <w:b/>
+          <w:bCs/>
+          <w:sz w:val="22"/>
+          <w:szCs w:val="22"/>
+        </w:rPr>
+        <w:t xml:space="preserve">Then:</w:t>
+      </w:r>
+    </w:p>
+    <w:p>
+      <w:pPr>
+        <w:pStyle w:val="ListParagraph"/>
+        <w:numPr>
+          <w:ilvl w:val="0"/>
+          <w:numId w:val="3"/>
+        </w:numPr>
+        <w:spacing w:after="50"/>
       </w:pPr>
       <w:r>
         <w:rPr>
@@ -1187,10 +1251,44 @@
     </w:p>
     <w:p>
       <w:pPr>
+        <w:pStyle w:val="ListParagraph"/>
+        <w:numPr>
+          <w:ilvl w:val="0"/>
+          <w:numId w:val="3"/>
+        </w:numPr>
+        <w:spacing w:after="50"/>
+      </w:pPr>
+      <w:r>
+        <w:rPr>
+          <w:sz w:val="22"/>
+          <w:szCs w:val="22"/>
+        </w:rPr>
+        <w:t xml:space="preserve">Click Calculate All &amp; Compare.</w:t>
+      </w:r>
+    </w:p>
+    <w:p>
+      <w:pPr>
+        <w:pStyle w:val="ListParagraph"/>
+        <w:numPr>
+          <w:ilvl w:val="0"/>
+          <w:numId w:val="3"/>
+        </w:numPr>
+        <w:spacing w:after="50"/>
+      </w:pPr>
+      <w:r>
+        <w:rPr>
+          <w:sz w:val="22"/>
+          <w:szCs w:val="22"/>
+        </w:rPr>
+        <w:t xml:space="preserve">Note the optimal bundle price, profit, demand, and margin.</w:t>
+      </w:r>
+    </w:p>
+    <w:p>
+      <w:pPr>
         <w:pStyle w:val="Heading1"/>
       </w:pPr>
       <w:r>
-        <w:t xml:space="preserve">Accessory Pricing</w:t>
+        <w:t xml:space="preserve">Step 3 — Accessory Pricing</w:t>
       </w:r>
     </w:p>
     <w:p>
@@ -1225,98 +1323,19 @@
     </w:p>
     <w:p>
       <w:pPr>
-        <w:pStyle w:val="Heading2"/>
-      </w:pPr>
-      <w:r>
-        <w:t xml:space="preserve">Questions:</w:t>
-      </w:r>
-    </w:p>
-    <w:p>
-      <w:pPr>
-        <w:pStyle w:val="ListParagraph"/>
-        <w:numPr>
-          <w:ilvl w:val="0"/>
-          <w:numId w:val="3"/>
-        </w:numPr>
-        <w:spacing w:after="60"/>
-      </w:pPr>
-      <w:r>
-        <w:rPr>
-          <w:sz w:val="22"/>
-          <w:szCs w:val="22"/>
-        </w:rPr>
-        <w:t xml:space="preserve">What is the implied pastry price?</w:t>
-      </w:r>
-    </w:p>
-    <w:p>
-      <w:pPr>
-        <w:pStyle w:val="ListParagraph"/>
-        <w:numPr>
-          <w:ilvl w:val="0"/>
-          <w:numId w:val="3"/>
-        </w:numPr>
-        <w:spacing w:after="60"/>
-      </w:pPr>
-      <w:r>
-        <w:rPr>
-          <w:sz w:val="22"/>
-          <w:szCs w:val="22"/>
-        </w:rPr>
-        <w:t xml:space="preserve">Compare the bundle margin vs the espresso-only margin. What does this tell you about the pastry’s perceived value?</w:t>
-      </w:r>
-    </w:p>
-    <w:p>
-      <w:pPr>
-        <w:pStyle w:val="ListParagraph"/>
-        <w:numPr>
-          <w:ilvl w:val="0"/>
-          <w:numId w:val="3"/>
-        </w:numPr>
-        <w:spacing w:after="60"/>
-      </w:pPr>
-      <w:r>
-        <w:rPr>
-          <w:sz w:val="22"/>
-          <w:szCs w:val="22"/>
-        </w:rPr>
-        <w:t xml:space="preserve">If the pastry’s implied price is lower than its VCu, what would you recommend?</w:t>
-      </w:r>
-    </w:p>
-    <w:p>
-      <w:pPr>
-        <w:pStyle w:val="Heading1"/>
-      </w:pPr>
-      <w:r>
-        <w:t xml:space="preserve">Deliverable</w:t>
-      </w:r>
-    </w:p>
-    <w:p>
-      <w:pPr>
-        <w:spacing w:after="100"/>
-      </w:pPr>
-      <w:r>
-        <w:rPr>
-          <w:sz w:val="22"/>
-          <w:szCs w:val="22"/>
-        </w:rPr>
-        <w:t xml:space="preserve">Submit a short report (1 page max) with:</w:t>
-      </w:r>
-    </w:p>
-    <w:p>
-      <w:pPr>
         <w:pStyle w:val="ListParagraph"/>
         <w:numPr>
           <w:ilvl w:val="0"/>
           <w:numId w:val="4"/>
         </w:numPr>
-        <w:spacing w:after="60"/>
-      </w:pPr>
-      <w:r>
-        <w:rPr>
-          <w:sz w:val="22"/>
-          <w:szCs w:val="22"/>
-        </w:rPr>
-        <w:t xml:space="preserve">Screenshots of the comparison panels for both studies.</w:t>
+        <w:spacing w:after="50"/>
+      </w:pPr>
+      <w:r>
+        <w:rPr>
+          <w:sz w:val="22"/>
+          <w:szCs w:val="22"/>
+        </w:rPr>
+        <w:t xml:space="preserve">Calculate the implied pastry price using the formula above.</w:t>
       </w:r>
     </w:p>
     <w:p>
@@ -1326,14 +1345,14 @@
           <w:ilvl w:val="0"/>
           <w:numId w:val="4"/>
         </w:numPr>
-        <w:spacing w:after="60"/>
-      </w:pPr>
-      <w:r>
-        <w:rPr>
-          <w:sz w:val="22"/>
-          <w:szCs w:val="22"/>
-        </w:rPr>
-        <w:t xml:space="preserve">A table with optimal price, profit, demand, and margin for All Market, Seg 1, Seg 2 (Study 1) and All Market (Study 2).</w:t>
+        <w:spacing w:after="50"/>
+      </w:pPr>
+      <w:r>
+        <w:rPr>
+          <w:sz w:val="22"/>
+          <w:szCs w:val="22"/>
+        </w:rPr>
+        <w:t xml:space="preserve">Calculate the pastry variable cost: Bundle VCu ($1.60) − Espresso VCu ($0.85).</w:t>
       </w:r>
     </w:p>
     <w:p>
@@ -1343,14 +1362,451 @@
           <w:ilvl w:val="0"/>
           <w:numId w:val="4"/>
         </w:numPr>
-        <w:spacing w:after="60"/>
-      </w:pPr>
-      <w:r>
-        <w:rPr>
-          <w:sz w:val="22"/>
-          <w:szCs w:val="22"/>
-        </w:rPr>
-        <w:t xml:space="preserve">The calculated pastry price and your pricing recommendation.</w:t>
+        <w:spacing w:after="50"/>
+      </w:pPr>
+      <w:r>
+        <w:rPr>
+          <w:sz w:val="22"/>
+          <w:szCs w:val="22"/>
+        </w:rPr>
+        <w:t xml:space="preserve">Compare the implied pastry price against its variable cost.</w:t>
+      </w:r>
+    </w:p>
+    <w:p>
+      <w:pPr>
+        <w:pStyle w:val="ListParagraph"/>
+        <w:numPr>
+          <w:ilvl w:val="0"/>
+          <w:numId w:val="4"/>
+        </w:numPr>
+        <w:spacing w:after="50"/>
+      </w:pPr>
+      <w:r>
+        <w:rPr>
+          <w:sz w:val="22"/>
+          <w:szCs w:val="22"/>
+        </w:rPr>
+        <w:t xml:space="preserve">Compare the bundle margin vs the espresso-only margin.</w:t>
+      </w:r>
+    </w:p>
+    <w:p>
+      <w:pPr>
+        <w:pStyle w:val="Heading1"/>
+      </w:pPr>
+      <w:r>
+        <w:t xml:space="preserve">Assessment</w:t>
+      </w:r>
+    </w:p>
+    <w:p>
+      <w:pPr>
+        <w:spacing w:after="120"/>
+      </w:pPr>
+      <w:r>
+        <w:rPr>
+          <w:sz w:val="22"/>
+          <w:szCs w:val="22"/>
+        </w:rPr>
+        <w:t xml:space="preserve">Once you have completed the three steps above, go to Blackboard and answer the </w:t>
+      </w:r>
+      <w:r>
+        <w:rPr>
+          <w:b/>
+          <w:bCs/>
+          <w:color w:val="C00000"/>
+          <w:sz w:val="22"/>
+          <w:szCs w:val="22"/>
+        </w:rPr>
+        <w:t xml:space="preserve">WTP Case Study Quiz</w:t>
+      </w:r>
+      <w:r>
+        <w:rPr>
+          <w:sz w:val="22"/>
+          <w:szCs w:val="22"/>
+        </w:rPr>
+        <w:t xml:space="preserve">.</w:t>
+      </w:r>
+    </w:p>
+    <w:p>
+      <w:pPr>
+        <w:spacing w:after="100"/>
+      </w:pPr>
+      <w:r>
+        <w:rPr>
+          <w:sz w:val="22"/>
+          <w:szCs w:val="22"/>
+        </w:rPr>
+        <w:t xml:space="preserve">The quiz contains 25 multiple-choice questions that test your understanding of:</w:t>
+      </w:r>
+    </w:p>
+    <w:tbl>
+      <w:tblPr>
+        <w:tblW w:type="dxa" w:w="9840"/>
+        <w:tblBorders>
+          <w:top w:val="single" w:color="auto" w:sz="4"/>
+          <w:left w:val="single" w:color="auto" w:sz="4"/>
+          <w:bottom w:val="single" w:color="auto" w:sz="4"/>
+          <w:right w:val="single" w:color="auto" w:sz="4"/>
+          <w:insideH w:val="single" w:color="auto" w:sz="4"/>
+          <w:insideV w:val="single" w:color="auto" w:sz="4"/>
+        </w:tblBorders>
+      </w:tblPr>
+      <w:tblGrid>
+        <w:gridCol w:w="2460"/>
+        <w:gridCol w:w="7380"/>
+      </w:tblGrid>
+      <w:tr>
+        <w:tc>
+          <w:tcPr>
+            <w:tcW w:type="dxa" w:w="2460"/>
+            <w:tcBorders>
+              <w:top w:val="single" w:color="CCCCCC" w:sz="1"/>
+              <w:left w:val="single" w:color="CCCCCC" w:sz="1"/>
+              <w:bottom w:val="single" w:color="CCCCCC" w:sz="1"/>
+              <w:right w:val="single" w:color="CCCCCC" w:sz="1"/>
+            </w:tcBorders>
+            <w:shd w:fill="1F4E79" w:val="clear"/>
+            <w:tcMar>
+              <w:top w:type="dxa" w:w="60"/>
+              <w:left w:type="dxa" w:w="100"/>
+              <w:bottom w:type="dxa" w:w="60"/>
+              <w:right w:type="dxa" w:w="100"/>
+            </w:tcMar>
+          </w:tcPr>
+          <w:p>
+            <w:pPr>
+              <w:jc w:val="left"/>
+            </w:pPr>
+            <w:r>
+              <w:rPr>
+                <w:rFonts w:ascii="Arial" w:cs="Arial" w:eastAsia="Arial" w:hAnsi="Arial"/>
+                <w:b/>
+                <w:bCs/>
+                <w:sz w:val="20"/>
+                <w:szCs w:val="20"/>
+              </w:rPr>
+              <w:t xml:space="preserve">Section</w:t>
+            </w:r>
+          </w:p>
+        </w:tc>
+        <w:tc>
+          <w:tcPr>
+            <w:tcW w:type="dxa" w:w="7380"/>
+            <w:tcBorders>
+              <w:top w:val="single" w:color="CCCCCC" w:sz="1"/>
+              <w:left w:val="single" w:color="CCCCCC" w:sz="1"/>
+              <w:bottom w:val="single" w:color="CCCCCC" w:sz="1"/>
+              <w:right w:val="single" w:color="CCCCCC" w:sz="1"/>
+            </w:tcBorders>
+            <w:shd w:fill="1F4E79" w:val="clear"/>
+            <w:tcMar>
+              <w:top w:type="dxa" w:w="60"/>
+              <w:left w:type="dxa" w:w="100"/>
+              <w:bottom w:type="dxa" w:w="60"/>
+              <w:right w:type="dxa" w:w="100"/>
+            </w:tcMar>
+          </w:tcPr>
+          <w:p>
+            <w:pPr>
+              <w:jc w:val="left"/>
+            </w:pPr>
+            <w:r>
+              <w:rPr>
+                <w:rFonts w:ascii="Arial" w:cs="Arial" w:eastAsia="Arial" w:hAnsi="Arial"/>
+                <w:b/>
+                <w:bCs/>
+                <w:sz w:val="20"/>
+                <w:szCs w:val="20"/>
+              </w:rPr>
+              <w:t xml:space="preserve">What you need to know</w:t>
+            </w:r>
+          </w:p>
+        </w:tc>
+      </w:tr>
+      <w:tr>
+        <w:tc>
+          <w:tcPr>
+            <w:tcW w:type="dxa" w:w="2460"/>
+            <w:tcBorders>
+              <w:top w:val="single" w:color="CCCCCC" w:sz="1"/>
+              <w:left w:val="single" w:color="CCCCCC" w:sz="1"/>
+              <w:bottom w:val="single" w:color="CCCCCC" w:sz="1"/>
+              <w:right w:val="single" w:color="CCCCCC" w:sz="1"/>
+            </w:tcBorders>
+            <w:tcMar>
+              <w:top w:type="dxa" w:w="60"/>
+              <w:left w:type="dxa" w:w="100"/>
+              <w:bottom w:type="dxa" w:w="60"/>
+              <w:right w:type="dxa" w:w="100"/>
+            </w:tcMar>
+          </w:tcPr>
+          <w:p>
+            <w:pPr>
+              <w:jc w:val="left"/>
+            </w:pPr>
+            <w:r>
+              <w:rPr>
+                <w:rFonts w:ascii="Arial" w:cs="Arial" w:eastAsia="Arial" w:hAnsi="Arial"/>
+                <w:b/>
+                <w:bCs/>
+                <w:sz w:val="20"/>
+                <w:szCs w:val="20"/>
+              </w:rPr>
+              <w:t xml:space="preserve">Espresso All Market</w:t>
+            </w:r>
+          </w:p>
+        </w:tc>
+        <w:tc>
+          <w:tcPr>
+            <w:tcW w:type="dxa" w:w="7380"/>
+            <w:tcBorders>
+              <w:top w:val="single" w:color="CCCCCC" w:sz="1"/>
+              <w:left w:val="single" w:color="CCCCCC" w:sz="1"/>
+              <w:bottom w:val="single" w:color="CCCCCC" w:sz="1"/>
+              <w:right w:val="single" w:color="CCCCCC" w:sz="1"/>
+            </w:tcBorders>
+            <w:tcMar>
+              <w:top w:type="dxa" w:w="60"/>
+              <w:left w:type="dxa" w:w="100"/>
+              <w:bottom w:type="dxa" w:w="60"/>
+              <w:right w:type="dxa" w:w="100"/>
+            </w:tcMar>
+          </w:tcPr>
+          <w:p>
+            <w:pPr>
+              <w:jc w:val="left"/>
+            </w:pPr>
+            <w:r>
+              <w:rPr>
+                <w:rFonts w:ascii="Arial" w:cs="Arial" w:eastAsia="Arial" w:hAnsi="Arial"/>
+                <w:b w:val="false"/>
+                <w:bCs w:val="false"/>
+                <w:sz w:val="20"/>
+                <w:szCs w:val="20"/>
+              </w:rPr>
+              <w:t xml:space="preserve">Optimal price, profit, demand, margin, and price-point details</w:t>
+            </w:r>
+          </w:p>
+        </w:tc>
+      </w:tr>
+      <w:tr>
+        <w:tc>
+          <w:tcPr>
+            <w:tcW w:type="dxa" w:w="2460"/>
+            <w:tcBorders>
+              <w:top w:val="single" w:color="CCCCCC" w:sz="1"/>
+              <w:left w:val="single" w:color="CCCCCC" w:sz="1"/>
+              <w:bottom w:val="single" w:color="CCCCCC" w:sz="1"/>
+              <w:right w:val="single" w:color="CCCCCC" w:sz="1"/>
+            </w:tcBorders>
+            <w:tcMar>
+              <w:top w:type="dxa" w:w="60"/>
+              <w:left w:type="dxa" w:w="100"/>
+              <w:bottom w:type="dxa" w:w="60"/>
+              <w:right w:type="dxa" w:w="100"/>
+            </w:tcMar>
+          </w:tcPr>
+          <w:p>
+            <w:pPr>
+              <w:jc w:val="left"/>
+            </w:pPr>
+            <w:r>
+              <w:rPr>
+                <w:rFonts w:ascii="Arial" w:cs="Arial" w:eastAsia="Arial" w:hAnsi="Arial"/>
+                <w:b/>
+                <w:bCs/>
+                <w:sz w:val="20"/>
+                <w:szCs w:val="20"/>
+              </w:rPr>
+              <w:t xml:space="preserve">Segmentation</w:t>
+            </w:r>
+          </w:p>
+        </w:tc>
+        <w:tc>
+          <w:tcPr>
+            <w:tcW w:type="dxa" w:w="7380"/>
+            <w:tcBorders>
+              <w:top w:val="single" w:color="CCCCCC" w:sz="1"/>
+              <w:left w:val="single" w:color="CCCCCC" w:sz="1"/>
+              <w:bottom w:val="single" w:color="CCCCCC" w:sz="1"/>
+              <w:right w:val="single" w:color="CCCCCC" w:sz="1"/>
+            </w:tcBorders>
+            <w:tcMar>
+              <w:top w:type="dxa" w:w="60"/>
+              <w:left w:type="dxa" w:w="100"/>
+              <w:bottom w:type="dxa" w:w="60"/>
+              <w:right w:type="dxa" w:w="100"/>
+            </w:tcMar>
+          </w:tcPr>
+          <w:p>
+            <w:pPr>
+              <w:jc w:val="left"/>
+            </w:pPr>
+            <w:r>
+              <w:rPr>
+                <w:rFonts w:ascii="Arial" w:cs="Arial" w:eastAsia="Arial" w:hAnsi="Arial"/>
+                <w:b w:val="false"/>
+                <w:bCs w:val="false"/>
+                <w:sz w:val="20"/>
+                <w:szCs w:val="20"/>
+              </w:rPr>
+              <w:t xml:space="preserve">Seg 1 and Seg 2 optimal prices, profits, margins, and whether segmented pricing beats a single price</w:t>
+            </w:r>
+          </w:p>
+        </w:tc>
+      </w:tr>
+      <w:tr>
+        <w:tc>
+          <w:tcPr>
+            <w:tcW w:type="dxa" w:w="2460"/>
+            <w:tcBorders>
+              <w:top w:val="single" w:color="CCCCCC" w:sz="1"/>
+              <w:left w:val="single" w:color="CCCCCC" w:sz="1"/>
+              <w:bottom w:val="single" w:color="CCCCCC" w:sz="1"/>
+              <w:right w:val="single" w:color="CCCCCC" w:sz="1"/>
+            </w:tcBorders>
+            <w:tcMar>
+              <w:top w:type="dxa" w:w="60"/>
+              <w:left w:type="dxa" w:w="100"/>
+              <w:bottom w:type="dxa" w:w="60"/>
+              <w:right w:type="dxa" w:w="100"/>
+            </w:tcMar>
+          </w:tcPr>
+          <w:p>
+            <w:pPr>
+              <w:jc w:val="left"/>
+            </w:pPr>
+            <w:r>
+              <w:rPr>
+                <w:rFonts w:ascii="Arial" w:cs="Arial" w:eastAsia="Arial" w:hAnsi="Arial"/>
+                <w:b/>
+                <w:bCs/>
+                <w:sz w:val="20"/>
+                <w:szCs w:val="20"/>
+              </w:rPr>
+              <w:t xml:space="preserve">Bundle</w:t>
+            </w:r>
+          </w:p>
+        </w:tc>
+        <w:tc>
+          <w:tcPr>
+            <w:tcW w:type="dxa" w:w="7380"/>
+            <w:tcBorders>
+              <w:top w:val="single" w:color="CCCCCC" w:sz="1"/>
+              <w:left w:val="single" w:color="CCCCCC" w:sz="1"/>
+              <w:bottom w:val="single" w:color="CCCCCC" w:sz="1"/>
+              <w:right w:val="single" w:color="CCCCCC" w:sz="1"/>
+            </w:tcBorders>
+            <w:tcMar>
+              <w:top w:type="dxa" w:w="60"/>
+              <w:left w:type="dxa" w:w="100"/>
+              <w:bottom w:type="dxa" w:w="60"/>
+              <w:right w:type="dxa" w:w="100"/>
+            </w:tcMar>
+          </w:tcPr>
+          <w:p>
+            <w:pPr>
+              <w:jc w:val="left"/>
+            </w:pPr>
+            <w:r>
+              <w:rPr>
+                <w:rFonts w:ascii="Arial" w:cs="Arial" w:eastAsia="Arial" w:hAnsi="Arial"/>
+                <w:b w:val="false"/>
+                <w:bCs w:val="false"/>
+                <w:sz w:val="20"/>
+                <w:szCs w:val="20"/>
+              </w:rPr>
+              <w:t xml:space="preserve">Optimal bundle price, profit, demand, and margin</w:t>
+            </w:r>
+          </w:p>
+        </w:tc>
+      </w:tr>
+      <w:tr>
+        <w:tc>
+          <w:tcPr>
+            <w:tcW w:type="dxa" w:w="2460"/>
+            <w:tcBorders>
+              <w:top w:val="single" w:color="CCCCCC" w:sz="1"/>
+              <w:left w:val="single" w:color="CCCCCC" w:sz="1"/>
+              <w:bottom w:val="single" w:color="CCCCCC" w:sz="1"/>
+              <w:right w:val="single" w:color="CCCCCC" w:sz="1"/>
+            </w:tcBorders>
+            <w:tcMar>
+              <w:top w:type="dxa" w:w="60"/>
+              <w:left w:type="dxa" w:w="100"/>
+              <w:bottom w:type="dxa" w:w="60"/>
+              <w:right w:type="dxa" w:w="100"/>
+            </w:tcMar>
+          </w:tcPr>
+          <w:p>
+            <w:pPr>
+              <w:jc w:val="left"/>
+            </w:pPr>
+            <w:r>
+              <w:rPr>
+                <w:rFonts w:ascii="Arial" w:cs="Arial" w:eastAsia="Arial" w:hAnsi="Arial"/>
+                <w:b/>
+                <w:bCs/>
+                <w:sz w:val="20"/>
+                <w:szCs w:val="20"/>
+              </w:rPr>
+              <w:t xml:space="preserve">Accessory Pricing</w:t>
+            </w:r>
+          </w:p>
+        </w:tc>
+        <w:tc>
+          <w:tcPr>
+            <w:tcW w:type="dxa" w:w="7380"/>
+            <w:tcBorders>
+              <w:top w:val="single" w:color="CCCCCC" w:sz="1"/>
+              <w:left w:val="single" w:color="CCCCCC" w:sz="1"/>
+              <w:bottom w:val="single" w:color="CCCCCC" w:sz="1"/>
+              <w:right w:val="single" w:color="CCCCCC" w:sz="1"/>
+            </w:tcBorders>
+            <w:tcMar>
+              <w:top w:type="dxa" w:w="60"/>
+              <w:left w:type="dxa" w:w="100"/>
+              <w:bottom w:type="dxa" w:w="60"/>
+              <w:right w:type="dxa" w:w="100"/>
+            </w:tcMar>
+          </w:tcPr>
+          <w:p>
+            <w:pPr>
+              <w:jc w:val="left"/>
+            </w:pPr>
+            <w:r>
+              <w:rPr>
+                <w:rFonts w:ascii="Arial" w:cs="Arial" w:eastAsia="Arial" w:hAnsi="Arial"/>
+                <w:b w:val="false"/>
+                <w:bCs w:val="false"/>
+                <w:sz w:val="20"/>
+                <w:szCs w:val="20"/>
+              </w:rPr>
+              <w:t xml:space="preserve">Implied pastry price, pastry variable cost, contribution margin, and pricing recommendation</w:t>
+            </w:r>
+          </w:p>
+        </w:tc>
+      </w:tr>
+    </w:tbl>
+    <w:p>
+      <w:pPr>
+        <w:spacing w:after="100" w:before="200"/>
+      </w:pPr>
+      <w:r>
+        <w:rPr>
+          <w:b/>
+          <w:bCs/>
+          <w:color w:val="2E75B6"/>
+          <w:sz w:val="22"/>
+          <w:szCs w:val="22"/>
+        </w:rPr>
+        <w:t xml:space="preserve">Tip: </w:t>
+      </w:r>
+      <w:r>
+        <w:rPr>
+          <w:sz w:val="22"/>
+          <w:szCs w:val="22"/>
+        </w:rPr>
+        <w:t xml:space="preserve">Keep the tool open while answering the quiz. You will need the exact numbers from the comparison panels and price-point tables.</w:t>
       </w:r>
     </w:p>
     <w:sectPr>
@@ -1555,8 +2011,8 @@
     <w:multiLevelType w:val="hybridMultilevel"/>
     <w:lvl w:ilvl="0" w15:tentative="1">
       <w:start w:val="1"/>
-      <w:numFmt w:val="bullet"/>
-      <w:lvlText w:val="•"/>
+      <w:numFmt w:val="decimal"/>
+      <w:lvlText w:val="%1."/>
       <w:lvlJc w:val="left"/>
       <w:pPr>
         <w:ind w:left="720" w:hanging="360"/>

</xml_diff>